<commit_message>
adding a readme file and updated hyperlinks tested in vscode
</commit_message>
<xml_diff>
--- a/module1/zwhite_assignment1.2.docx
+++ b/module1/zwhite_assignment1.2.docx
@@ -99,35 +99,71 @@
           <w:sz w:val="24"/>
           <w:szCs w:val="24"/>
         </w:rPr>
-        <w:t xml:space="preserve">In this assignment, I established the directory structure and version control workflow for CSD 325 </w:t>
-      </w:r>
+        <w:t xml:space="preserve">In this assignment, I established the directory structure and version control workflow for CSD </w:t>
+      </w:r>
+      <w:proofErr w:type="gramStart"/>
       <w:r>
         <w:rPr>
           <w:sz w:val="24"/>
           <w:szCs w:val="24"/>
         </w:rPr>
-        <w:t xml:space="preserve"> </w:t>
-      </w:r>
+        <w:t>325  Advanced</w:t>
+      </w:r>
+      <w:proofErr w:type="gramEnd"/>
       <w:r>
         <w:rPr>
           <w:sz w:val="24"/>
           <w:szCs w:val="24"/>
         </w:rPr>
-        <w:t>Advanced Python. Starting in my local CSD325 directory, I created a new subdirectory called module1 using the mkdir command and confirmed its presence with the dir command on Windows. I then opened a Word document, added my name and assignment information, and embedded a screenshot of the directory listing before saving the file as zwhite_assignment1.2.docx inside the module1 folder. After verifying the repository status with git status, I staged all new files using git add --all, committed the changes with a timestamped message, and pushed everything to my remote GitHub repository using git push origin main. This assignment reinforced the importance of maintaining a clean, organized file structure alongside consistent version control practices</w:t>
-      </w:r>
+        <w:t xml:space="preserve"> Python. Starting in my local CSD325 directory, I created a new subdirectory called module1 using the </w:t>
+      </w:r>
+      <w:proofErr w:type="spellStart"/>
       <w:r>
         <w:rPr>
           <w:sz w:val="24"/>
           <w:szCs w:val="24"/>
         </w:rPr>
-        <w:t>,</w:t>
-      </w:r>
+        <w:t>mkdir</w:t>
+      </w:r>
+      <w:proofErr w:type="spellEnd"/>
       <w:r>
         <w:rPr>
           <w:sz w:val="24"/>
           <w:szCs w:val="24"/>
         </w:rPr>
-        <w:t xml:space="preserve"> habits that are especially valuable when managing multiple Python projects and modules throughout the course.</w:t>
+        <w:t xml:space="preserve"> command and confirmed its presence with the </w:t>
+      </w:r>
+      <w:proofErr w:type="spellStart"/>
+      <w:r>
+        <w:rPr>
+          <w:sz w:val="24"/>
+          <w:szCs w:val="24"/>
+        </w:rPr>
+        <w:t>dir</w:t>
+      </w:r>
+      <w:proofErr w:type="spellEnd"/>
+      <w:r>
+        <w:rPr>
+          <w:sz w:val="24"/>
+          <w:szCs w:val="24"/>
+        </w:rPr>
+        <w:t xml:space="preserve"> command on Windows. I then opened a Word document, added my name and assignment information, and embedded a screenshot of the directory </w:t>
+      </w:r>
+      <w:proofErr w:type="gramStart"/>
+      <w:r>
+        <w:rPr>
+          <w:sz w:val="24"/>
+          <w:szCs w:val="24"/>
+        </w:rPr>
+        <w:t>listing</w:t>
+      </w:r>
+      <w:proofErr w:type="gramEnd"/>
+      <w:r>
+        <w:rPr>
+          <w:sz w:val="24"/>
+          <w:szCs w:val="24"/>
+        </w:rPr>
+        <w:t xml:space="preserve"> before saving the file as zwhite_assignment1.2.docx inside the module1 folder. After verifying the repository status with git status, I staged all new files using git add --all, committed the changes with a timestamped message, and pushed everything to my remote GitHub repository using git push origin main. This assignment reinforced the importance of maintaining a clean, organized file structure alongside consistent version control practices, habits that are especially valuable when managing multiple Python projects and modules throughout the course.</w:t>
       </w:r>
     </w:p>
     <w:p>
@@ -1330,6 +1366,18 @@
       <w:u w:val="single"/>
     </w:rPr>
   </w:style>
+  <w:style w:type="character" w:styleId="FollowedHyperlink">
+    <w:name w:val="FollowedHyperlink"/>
+    <w:basedOn w:val="DefaultParagraphFont"/>
+    <w:uiPriority w:val="99"/>
+    <w:semiHidden/>
+    <w:unhideWhenUsed/>
+    <w:rsid w:val="0005520A"/>
+    <w:rPr>
+      <w:color w:val="96607D" w:themeColor="followedHyperlink"/>
+      <w:u w:val="single"/>
+    </w:rPr>
+  </w:style>
 </w:styles>
 </file>
 

</xml_diff>

<commit_message>
syncing local repo updating readme
</commit_message>
<xml_diff>
--- a/module1/zwhite_assignment1.2.docx
+++ b/module1/zwhite_assignment1.2.docx
@@ -8,8 +8,13 @@
       </w:pPr>
       <w:r>
         <w:rPr>
-          <w:b/>
-          <w:bCs/>
+          <w:sz w:val="24"/>
+          <w:szCs w:val="24"/>
+        </w:rPr>
+        <w:t xml:space="preserve">Name: </w:t>
+      </w:r>
+      <w:r>
+        <w:rPr>
           <w:sz w:val="24"/>
           <w:szCs w:val="24"/>
         </w:rPr>
@@ -25,6 +30,13 @@
           <w:sz w:val="24"/>
           <w:szCs w:val="24"/>
         </w:rPr>
+        <w:t xml:space="preserve">Instructor: </w:t>
+      </w:r>
+      <w:r>
+        <w:rPr>
+          <w:sz w:val="24"/>
+          <w:szCs w:val="24"/>
+        </w:rPr>
         <w:t>Darrell Payne</w:t>
       </w:r>
     </w:p>
@@ -37,6 +49,13 @@
           <w:sz w:val="24"/>
           <w:szCs w:val="24"/>
         </w:rPr>
+        <w:t xml:space="preserve">Class: </w:t>
+      </w:r>
+      <w:r>
+        <w:rPr>
+          <w:sz w:val="24"/>
+          <w:szCs w:val="24"/>
+        </w:rPr>
         <w:t>CSD 325</w:t>
       </w:r>
     </w:p>
@@ -44,6 +63,13 @@
       <w:pPr>
         <w:spacing w:after="280" w:line="480" w:lineRule="auto"/>
       </w:pPr>
+      <w:r>
+        <w:rPr>
+          <w:sz w:val="24"/>
+          <w:szCs w:val="24"/>
+        </w:rPr>
+        <w:t xml:space="preserve">Date: </w:t>
+      </w:r>
       <w:r>
         <w:rPr>
           <w:sz w:val="24"/>
@@ -86,12 +112,8 @@
     </w:p>
     <w:p>
       <w:pPr>
-        <w:spacing w:after="120" w:line="480" w:lineRule="auto"/>
-      </w:pPr>
-    </w:p>
-    <w:p>
-      <w:pPr>
         <w:spacing w:after="360" w:line="480" w:lineRule="auto"/>
+        <w:ind w:firstLine="720"/>
         <w:jc w:val="both"/>
       </w:pPr>
       <w:r>
@@ -99,23 +121,23 @@
           <w:sz w:val="24"/>
           <w:szCs w:val="24"/>
         </w:rPr>
-        <w:t xml:space="preserve">In this assignment, I established the directory structure and version control workflow for CSD </w:t>
-      </w:r>
-      <w:proofErr w:type="gramStart"/>
+        <w:t xml:space="preserve">In this assignment, I established the directory structure and version control workflow for CSD 325  Advanced Python. Starting in my local CSD325 directory, I created a new subdirectory called module1 using the </w:t>
+      </w:r>
+      <w:proofErr w:type="spellStart"/>
       <w:r>
         <w:rPr>
           <w:sz w:val="24"/>
           <w:szCs w:val="24"/>
         </w:rPr>
-        <w:t>325  Advanced</w:t>
-      </w:r>
-      <w:proofErr w:type="gramEnd"/>
+        <w:t>mkdir</w:t>
+      </w:r>
+      <w:proofErr w:type="spellEnd"/>
       <w:r>
         <w:rPr>
           <w:sz w:val="24"/>
           <w:szCs w:val="24"/>
         </w:rPr>
-        <w:t xml:space="preserve"> Python. Starting in my local CSD325 directory, I created a new subdirectory called module1 using the </w:t>
+        <w:t xml:space="preserve"> command and confirmed its presence with the </w:t>
       </w:r>
       <w:proofErr w:type="spellStart"/>
       <w:r>
@@ -123,7 +145,7 @@
           <w:sz w:val="24"/>
           <w:szCs w:val="24"/>
         </w:rPr>
-        <w:t>mkdir</w:t>
+        <w:t>dir</w:t>
       </w:r>
       <w:proofErr w:type="spellEnd"/>
       <w:r>
@@ -131,39 +153,7 @@
           <w:sz w:val="24"/>
           <w:szCs w:val="24"/>
         </w:rPr>
-        <w:t xml:space="preserve"> command and confirmed its presence with the </w:t>
-      </w:r>
-      <w:proofErr w:type="spellStart"/>
-      <w:r>
-        <w:rPr>
-          <w:sz w:val="24"/>
-          <w:szCs w:val="24"/>
-        </w:rPr>
-        <w:t>dir</w:t>
-      </w:r>
-      <w:proofErr w:type="spellEnd"/>
-      <w:r>
-        <w:rPr>
-          <w:sz w:val="24"/>
-          <w:szCs w:val="24"/>
-        </w:rPr>
-        <w:t xml:space="preserve"> command on Windows. I then opened a Word document, added my name and assignment information, and embedded a screenshot of the directory </w:t>
-      </w:r>
-      <w:proofErr w:type="gramStart"/>
-      <w:r>
-        <w:rPr>
-          <w:sz w:val="24"/>
-          <w:szCs w:val="24"/>
-        </w:rPr>
-        <w:t>listing</w:t>
-      </w:r>
-      <w:proofErr w:type="gramEnd"/>
-      <w:r>
-        <w:rPr>
-          <w:sz w:val="24"/>
-          <w:szCs w:val="24"/>
-        </w:rPr>
-        <w:t xml:space="preserve"> before saving the file as zwhite_assignment1.2.docx inside the module1 folder. After verifying the repository status with git status, I staged all new files using git add --all, committed the changes with a timestamped message, and pushed everything to my remote GitHub repository using git push origin main. This assignment reinforced the importance of maintaining a clean, organized file structure alongside consistent version control practices, habits that are especially valuable when managing multiple Python projects and modules throughout the course.</w:t>
+        <w:t xml:space="preserve"> command on Windows. I then opened a Word document, added my name and assignment information, and embedded a screenshot of the directory listing before saving the file as zwhite_assignment1.2.docx inside the module1 folder. After verifying the repository status with git status, I staged all new files using git add --all, committed the changes with a timestamped message, and pushed everything to my remote GitHub repository using git push origin main. This assignment reinforced the importance of maintaining a clean, organized file structure alongside consistent version control practices, habits that are especially valuable when managing multiple Python projects and modules throughout the course.</w:t>
       </w:r>
     </w:p>
     <w:p>

</xml_diff>